<commit_message>
terza versione consegna esame to merge deploy
</commit_message>
<xml_diff>
--- a/Fresh Carrots/report/Report_IUM_Buoso_Driza.docx
+++ b/Fresh Carrots/report/Report_IUM_Buoso_Driza.docx
@@ -879,7 +879,19 @@
         <w:rPr>
           <w:rFonts w:ascii="Calibri" w:eastAsia="Calibri" w:hAnsi="Calibri" w:cs="Calibri"/>
         </w:rPr>
-        <w:t xml:space="preserve">Il progetto è stato costruito su tre storie diverse, aventi fini diversi ma che trattano temi ricorrenti come il genere, il tema, le recensioni e le premiazioni. </w:t>
+        <w:t xml:space="preserve">Il progetto è stato costruito su </w:t>
+      </w:r>
+      <w:r>
+        <w:rPr>
+          <w:rFonts w:ascii="Calibri" w:eastAsia="Calibri" w:hAnsi="Calibri" w:cs="Calibri"/>
+        </w:rPr>
+        <w:t>due</w:t>
+      </w:r>
+      <w:r>
+        <w:rPr>
+          <w:rFonts w:ascii="Calibri" w:eastAsia="Calibri" w:hAnsi="Calibri" w:cs="Calibri"/>
+        </w:rPr>
+        <w:t xml:space="preserve"> storie diverse, aventi fini diversi ma che trattano temi ricorrenti come il genere, il tema, le recensioni e le premiazioni. </w:t>
       </w:r>
     </w:p>
     <w:p>
@@ -1068,7 +1080,7 @@
           <w:rFonts w:ascii="Calibri" w:eastAsia="Calibri" w:hAnsi="Calibri" w:cs="Calibri"/>
           <w:color w:val="000000" w:themeColor="text1"/>
         </w:rPr>
-        <w:t xml:space="preserve">tre </w:t>
+        <w:t xml:space="preserve">due </w:t>
       </w:r>
       <w:r>
         <w:rPr>
@@ -1231,7 +1243,19 @@
           <w:rFonts w:ascii="Calibri" w:eastAsia="Calibri" w:hAnsi="Calibri" w:cs="Calibri"/>
         </w:rPr>
         <w:br/>
-        <w:t>Durante questa fase abbiamo pensato di creare un dataset aggiuntivo, di fondamentale importanza per tutte le tre storie sviluppate, contenente solamente i film rilasciati in almeno un paese del mondo.</w:t>
+        <w:t xml:space="preserve">Durante questa fase abbiamo pensato di creare un dataset aggiuntivo, di fondamentale importanza per tutte le </w:t>
+      </w:r>
+      <w:r>
+        <w:rPr>
+          <w:rFonts w:ascii="Calibri" w:eastAsia="Calibri" w:hAnsi="Calibri" w:cs="Calibri"/>
+        </w:rPr>
+        <w:t>due</w:t>
+      </w:r>
+      <w:r>
+        <w:rPr>
+          <w:rFonts w:ascii="Calibri" w:eastAsia="Calibri" w:hAnsi="Calibri" w:cs="Calibri"/>
+        </w:rPr>
+        <w:t xml:space="preserve"> storie sviluppate, contenente solamente i film rilasciati in almeno un paese del mondo.</w:t>
       </w:r>
     </w:p>
     <w:p>
@@ -1352,7 +1376,7 @@
         <w:rPr>
           <w:rFonts w:ascii="Calibri" w:hAnsi="Calibri" w:cs="Calibri"/>
         </w:rPr>
-        <w:t>Trend di popolarità (rating) dei film nel tempo</w:t>
+        <w:t>Evoluzione e influenze: la storia dei rating cinematografici nel tempo</w:t>
       </w:r>
     </w:p>
     <w:p>
@@ -1385,40 +1409,7 @@
           <w:rFonts w:ascii="Calibri" w:hAnsi="Calibri" w:cs="Calibri"/>
           <w:bdr w:val="none" w:sz="0" w:space="0" w:color="auto" w:frame="1"/>
         </w:rPr>
-        <w:t>Analisi degli Oscar dei paesi produttori di film</w:t>
-      </w:r>
-    </w:p>
-    <w:p>
-      <w:pPr>
-        <w:pStyle w:val="ListParagraph"/>
-        <w:numPr>
-          <w:ilvl w:val="1"/>
-          <w:numId w:val="3"/>
-        </w:numPr>
-        <w:rPr>
-          <w:rFonts w:ascii="Calibri" w:eastAsia="Calibri" w:hAnsi="Calibri" w:cs="Calibri"/>
-        </w:rPr>
-      </w:pPr>
-      <w:r>
-        <w:rPr>
-          <w:rFonts w:ascii="Calibri" w:eastAsia="Calibri" w:hAnsi="Calibri" w:cs="Calibri"/>
-          <w:b/>
-          <w:bCs/>
-        </w:rPr>
-        <w:t>Terza storia:</w:t>
-      </w:r>
-      <w:r>
-        <w:rPr>
-          <w:rFonts w:ascii="Calibri" w:eastAsia="Calibri" w:hAnsi="Calibri" w:cs="Calibri"/>
-        </w:rPr>
-        <w:t xml:space="preserve"> </w:t>
-      </w:r>
-      <w:r>
-        <w:rPr>
-          <w:rFonts w:ascii="Calibri" w:hAnsi="Calibri" w:cs="Calibri"/>
-          <w:bdr w:val="none" w:sz="0" w:space="0" w:color="auto" w:frame="1"/>
-        </w:rPr>
-        <w:t>Come i temi dei film sono cambiati nel tempo</w:t>
+        <w:t>Caccia all’Oscar: successo cinematografico tra merito, strategia e geografia.</w:t>
       </w:r>
     </w:p>
     <w:p>
@@ -2242,13 +2233,19 @@
         <w:rPr>
           <w:rFonts w:ascii="Calibri" w:eastAsia="Calibri" w:hAnsi="Calibri" w:cs="Calibri"/>
         </w:rPr>
-        <w:t xml:space="preserve">La nostra analisi sviluppa queste </w:t>
-      </w:r>
-      <w:r>
-        <w:rPr>
-          <w:rFonts w:ascii="Calibri" w:eastAsia="Calibri" w:hAnsi="Calibri" w:cs="Calibri"/>
-        </w:rPr>
-        <w:t xml:space="preserve">tre </w:t>
+        <w:t>La nostra analisi sviluppa queste</w:t>
+      </w:r>
+      <w:r>
+        <w:rPr>
+          <w:rFonts w:ascii="Calibri" w:eastAsia="Calibri" w:hAnsi="Calibri" w:cs="Calibri"/>
+        </w:rPr>
+        <w:t xml:space="preserve"> due</w:t>
+      </w:r>
+      <w:r>
+        <w:rPr>
+          <w:rFonts w:ascii="Calibri" w:eastAsia="Calibri" w:hAnsi="Calibri" w:cs="Calibri"/>
+        </w:rPr>
+        <w:t xml:space="preserve"> </w:t>
       </w:r>
       <w:r>
         <w:rPr>
@@ -2422,21 +2419,19 @@
         <w:rPr>
           <w:rFonts w:ascii="Calibri" w:eastAsia="Calibri" w:hAnsi="Calibri" w:cs="Calibri"/>
         </w:rPr>
-        <w:t xml:space="preserve">, proponendo sempre </w:t>
-      </w:r>
-      <w:proofErr w:type="gramStart"/>
-      <w:r>
-        <w:rPr>
-          <w:rFonts w:ascii="Calibri" w:eastAsia="Calibri" w:hAnsi="Calibri" w:cs="Calibri"/>
-        </w:rPr>
-        <w:t>all’altro idee</w:t>
-      </w:r>
-      <w:proofErr w:type="gramEnd"/>
-      <w:r>
-        <w:rPr>
-          <w:rFonts w:ascii="Calibri" w:eastAsia="Calibri" w:hAnsi="Calibri" w:cs="Calibri"/>
-        </w:rPr>
-        <w:t xml:space="preserve"> di spunto.</w:t>
+        <w:t xml:space="preserve">, proponendo sempre all’altro </w:t>
+      </w:r>
+      <w:r>
+        <w:rPr>
+          <w:rFonts w:ascii="Calibri" w:eastAsia="Calibri" w:hAnsi="Calibri" w:cs="Calibri"/>
+        </w:rPr>
+        <w:t xml:space="preserve">membro </w:t>
+      </w:r>
+      <w:r>
+        <w:rPr>
+          <w:rFonts w:ascii="Calibri" w:eastAsia="Calibri" w:hAnsi="Calibri" w:cs="Calibri"/>
+        </w:rPr>
+        <w:t>idee di spunto.</w:t>
       </w:r>
     </w:p>
     <w:p>
@@ -2490,7 +2485,7 @@
         <w:rPr>
           <w:rFonts w:ascii="Calibri" w:eastAsia="Calibri" w:hAnsi="Calibri" w:cs="Calibri"/>
         </w:rPr>
-        <w:t xml:space="preserve">più della prima storia e della prima parte della seconda, </w:t>
+        <w:t xml:space="preserve">più della prima storia </w:t>
       </w:r>
       <w:r>
         <w:rPr>
@@ -2504,13 +2499,13 @@
         <w:rPr>
           <w:rFonts w:ascii="Calibri" w:eastAsia="Calibri" w:hAnsi="Calibri" w:cs="Calibri"/>
         </w:rPr>
-        <w:t xml:space="preserve">ha concluso </w:t>
-      </w:r>
-      <w:r>
-        <w:rPr>
-          <w:rFonts w:ascii="Calibri" w:eastAsia="Calibri" w:hAnsi="Calibri" w:cs="Calibri"/>
-        </w:rPr>
-        <w:t xml:space="preserve">la seconda parte e </w:t>
+        <w:t>ha ideato e</w:t>
+      </w:r>
+      <w:r>
+        <w:rPr>
+          <w:rFonts w:ascii="Calibri" w:eastAsia="Calibri" w:hAnsi="Calibri" w:cs="Calibri"/>
+        </w:rPr>
+        <w:t xml:space="preserve"> </w:t>
       </w:r>
       <w:r>
         <w:rPr>
@@ -2792,6 +2787,18 @@
       <w:bookmarkEnd w:id="9"/>
     </w:p>
     <w:p>
+      <w:pPr>
+        <w:pStyle w:val="ListParagraph"/>
+        <w:numPr>
+          <w:ilvl w:val="0"/>
+          <w:numId w:val="10"/>
+        </w:numPr>
+        <w:rPr>
+          <w:rStyle w:val="Hyperlink"/>
+          <w:color w:val="auto"/>
+          <w:u w:val="none"/>
+        </w:rPr>
+      </w:pPr>
       <w:proofErr w:type="spellStart"/>
       <w:r>
         <w:rPr>
@@ -2844,6 +2851,28 @@
     </w:p>
     <w:p>
       <w:pPr>
+        <w:pStyle w:val="ListParagraph"/>
+        <w:numPr>
+          <w:ilvl w:val="0"/>
+          <w:numId w:val="10"/>
+        </w:numPr>
+      </w:pPr>
+      <w:hyperlink r:id="rId9" w:history="1">
+        <w:proofErr w:type="spellStart"/>
+        <w:proofErr w:type="gramStart"/>
+        <w:r>
+          <w:rPr>
+            <w:rStyle w:val="Hyperlink"/>
+            <w:rFonts w:ascii="Calibri" w:eastAsia="Calibri" w:hAnsi="Calibri" w:cs="Calibri"/>
+          </w:rPr>
+          <w:t>Pandas.Dataframe.idxmax</w:t>
+        </w:r>
+        <w:proofErr w:type="spellEnd"/>
+        <w:proofErr w:type="gramEnd"/>
+      </w:hyperlink>
+    </w:p>
+    <w:p>
+      <w:pPr>
         <w:rPr>
           <w:rFonts w:ascii="Calibri" w:eastAsia="Calibri" w:hAnsi="Calibri" w:cs="Calibri"/>
         </w:rPr>
@@ -2862,8 +2891,8 @@
       </w:r>
     </w:p>
     <w:sectPr>
-      <w:headerReference w:type="default" r:id="rId9"/>
-      <w:footerReference w:type="default" r:id="rId10"/>
+      <w:headerReference w:type="default" r:id="rId10"/>
+      <w:footerReference w:type="default" r:id="rId11"/>
       <w:pgSz w:w="11906" w:h="16838"/>
       <w:pgMar w:top="720" w:right="720" w:bottom="720" w:left="720" w:header="720" w:footer="720" w:gutter="0"/>
       <w:cols w:space="720"/>
@@ -3048,6 +3077,119 @@
 <file path=word/numbering.xml><?xml version="1.0" encoding="utf-8"?>
 <w:numbering xmlns:wpc="http://schemas.microsoft.com/office/word/2010/wordprocessingCanvas" xmlns:cx="http://schemas.microsoft.com/office/drawing/2014/chartex" xmlns:cx1="http://schemas.microsoft.com/office/drawing/2015/9/8/chartex" xmlns:cx2="http://schemas.microsoft.com/office/drawing/2015/10/21/chartex" xmlns:cx3="http://schemas.microsoft.com/office/drawing/2016/5/9/chartex" xmlns:cx4="http://schemas.microsoft.com/office/drawing/2016/5/10/chartex" xmlns:cx5="http://schemas.microsoft.com/office/drawing/2016/5/11/chartex" xmlns:cx6="http://schemas.microsoft.com/office/drawing/2016/5/12/chartex" xmlns:cx7="http://schemas.microsoft.com/office/drawing/2016/5/13/chartex" xmlns:cx8="http://schemas.microsoft.com/office/drawing/2016/5/14/chartex" xmlns:mc="http://schemas.openxmlformats.org/markup-compatibility/2006" xmlns:aink="http://schemas.microsoft.com/office/drawing/2016/ink" xmlns:am3d="http://schemas.microsoft.com/office/drawing/2017/model3d" xmlns:o="urn:schemas-microsoft-com:office:office" xmlns:oel="http://schemas.microsoft.com/office/2019/extlst" xmlns:r="http://schemas.openxmlformats.org/officeDocument/2006/relationships" xmlns:m="http://schemas.openxmlformats.org/officeDocument/2006/math" xmlns:v="urn:schemas-microsoft-com:vml" xmlns:wp14="http://schemas.microsoft.com/office/word/2010/wordprocessingDrawing" xmlns:wp="http://schemas.openxmlformats.org/drawingml/2006/wordprocessingDrawing" xmlns:w10="urn:schemas-microsoft-com:office:word" xmlns:w="http://schemas.openxmlformats.org/wordprocessingml/2006/main" xmlns:w14="http://schemas.microsoft.com/office/word/2010/wordml" xmlns:w15="http://schemas.microsoft.com/office/word/2012/wordml" xmlns:w16cex="http://schemas.microsoft.com/office/word/2018/wordml/cex" xmlns:w16cid="http://schemas.microsoft.com/office/word/2016/wordml/cid" xmlns:w16="http://schemas.microsoft.com/office/word/2018/wordml" xmlns:w16du="http://schemas.microsoft.com/office/word/2023/wordml/word16du" xmlns:w16sdtdh="http://schemas.microsoft.com/office/word/2020/wordml/sdtdatahash" xmlns:w16se="http://schemas.microsoft.com/office/word/2015/wordml/symex" xmlns:wpg="http://schemas.microsoft.com/office/word/2010/wordprocessingGroup" xmlns:wpi="http://schemas.microsoft.com/office/word/2010/wordprocessingInk" xmlns:wne="http://schemas.microsoft.com/office/word/2006/wordml" xmlns:wps="http://schemas.microsoft.com/office/word/2010/wordprocessingShape" mc:Ignorable="w14 w15 w16se w16cid w16 w16cex w16sdtdh wp14">
   <w:abstractNum w:abstractNumId="0" w15:restartNumberingAfterBreak="0">
+    <w:nsid w:val="0D814133"/>
+    <w:multiLevelType w:val="hybridMultilevel"/>
+    <w:tmpl w:val="E99ED5F6"/>
+    <w:lvl w:ilvl="0" w:tplc="08090001">
+      <w:start w:val="1"/>
+      <w:numFmt w:val="bullet"/>
+      <w:lvlText w:val=""/>
+      <w:lvlJc w:val="left"/>
+      <w:pPr>
+        <w:ind w:left="720" w:hanging="360"/>
+      </w:pPr>
+      <w:rPr>
+        <w:rFonts w:ascii="Symbol" w:hAnsi="Symbol" w:hint="default"/>
+      </w:rPr>
+    </w:lvl>
+    <w:lvl w:ilvl="1" w:tplc="08090003" w:tentative="1">
+      <w:start w:val="1"/>
+      <w:numFmt w:val="bullet"/>
+      <w:lvlText w:val="o"/>
+      <w:lvlJc w:val="left"/>
+      <w:pPr>
+        <w:ind w:left="1440" w:hanging="360"/>
+      </w:pPr>
+      <w:rPr>
+        <w:rFonts w:ascii="Courier New" w:hAnsi="Courier New" w:cs="Courier New" w:hint="default"/>
+      </w:rPr>
+    </w:lvl>
+    <w:lvl w:ilvl="2" w:tplc="08090005" w:tentative="1">
+      <w:start w:val="1"/>
+      <w:numFmt w:val="bullet"/>
+      <w:lvlText w:val=""/>
+      <w:lvlJc w:val="left"/>
+      <w:pPr>
+        <w:ind w:left="2160" w:hanging="360"/>
+      </w:pPr>
+      <w:rPr>
+        <w:rFonts w:ascii="Wingdings" w:hAnsi="Wingdings" w:hint="default"/>
+      </w:rPr>
+    </w:lvl>
+    <w:lvl w:ilvl="3" w:tplc="08090001" w:tentative="1">
+      <w:start w:val="1"/>
+      <w:numFmt w:val="bullet"/>
+      <w:lvlText w:val=""/>
+      <w:lvlJc w:val="left"/>
+      <w:pPr>
+        <w:ind w:left="2880" w:hanging="360"/>
+      </w:pPr>
+      <w:rPr>
+        <w:rFonts w:ascii="Symbol" w:hAnsi="Symbol" w:hint="default"/>
+      </w:rPr>
+    </w:lvl>
+    <w:lvl w:ilvl="4" w:tplc="08090003" w:tentative="1">
+      <w:start w:val="1"/>
+      <w:numFmt w:val="bullet"/>
+      <w:lvlText w:val="o"/>
+      <w:lvlJc w:val="left"/>
+      <w:pPr>
+        <w:ind w:left="3600" w:hanging="360"/>
+      </w:pPr>
+      <w:rPr>
+        <w:rFonts w:ascii="Courier New" w:hAnsi="Courier New" w:cs="Courier New" w:hint="default"/>
+      </w:rPr>
+    </w:lvl>
+    <w:lvl w:ilvl="5" w:tplc="08090005" w:tentative="1">
+      <w:start w:val="1"/>
+      <w:numFmt w:val="bullet"/>
+      <w:lvlText w:val=""/>
+      <w:lvlJc w:val="left"/>
+      <w:pPr>
+        <w:ind w:left="4320" w:hanging="360"/>
+      </w:pPr>
+      <w:rPr>
+        <w:rFonts w:ascii="Wingdings" w:hAnsi="Wingdings" w:hint="default"/>
+      </w:rPr>
+    </w:lvl>
+    <w:lvl w:ilvl="6" w:tplc="08090001" w:tentative="1">
+      <w:start w:val="1"/>
+      <w:numFmt w:val="bullet"/>
+      <w:lvlText w:val=""/>
+      <w:lvlJc w:val="left"/>
+      <w:pPr>
+        <w:ind w:left="5040" w:hanging="360"/>
+      </w:pPr>
+      <w:rPr>
+        <w:rFonts w:ascii="Symbol" w:hAnsi="Symbol" w:hint="default"/>
+      </w:rPr>
+    </w:lvl>
+    <w:lvl w:ilvl="7" w:tplc="08090003" w:tentative="1">
+      <w:start w:val="1"/>
+      <w:numFmt w:val="bullet"/>
+      <w:lvlText w:val="o"/>
+      <w:lvlJc w:val="left"/>
+      <w:pPr>
+        <w:ind w:left="5760" w:hanging="360"/>
+      </w:pPr>
+      <w:rPr>
+        <w:rFonts w:ascii="Courier New" w:hAnsi="Courier New" w:cs="Courier New" w:hint="default"/>
+      </w:rPr>
+    </w:lvl>
+    <w:lvl w:ilvl="8" w:tplc="08090005" w:tentative="1">
+      <w:start w:val="1"/>
+      <w:numFmt w:val="bullet"/>
+      <w:lvlText w:val=""/>
+      <w:lvlJc w:val="left"/>
+      <w:pPr>
+        <w:ind w:left="6480" w:hanging="360"/>
+      </w:pPr>
+      <w:rPr>
+        <w:rFonts w:ascii="Wingdings" w:hAnsi="Wingdings" w:hint="default"/>
+      </w:rPr>
+    </w:lvl>
+  </w:abstractNum>
+  <w:abstractNum w:abstractNumId="1" w15:restartNumberingAfterBreak="0">
     <w:nsid w:val="160F69E4"/>
     <w:multiLevelType w:val="hybridMultilevel"/>
     <w:tmpl w:val="AB404626"/>
@@ -3160,7 +3302,7 @@
       </w:rPr>
     </w:lvl>
   </w:abstractNum>
-  <w:abstractNum w:abstractNumId="1" w15:restartNumberingAfterBreak="0">
+  <w:abstractNum w:abstractNumId="2" w15:restartNumberingAfterBreak="0">
     <w:nsid w:val="280402A9"/>
     <w:multiLevelType w:val="hybridMultilevel"/>
     <w:tmpl w:val="76A2C7EE"/>
@@ -3246,7 +3388,7 @@
       </w:pPr>
     </w:lvl>
   </w:abstractNum>
-  <w:abstractNum w:abstractNumId="2" w15:restartNumberingAfterBreak="0">
+  <w:abstractNum w:abstractNumId="3" w15:restartNumberingAfterBreak="0">
     <w:nsid w:val="2C5980E8"/>
     <w:multiLevelType w:val="hybridMultilevel"/>
     <w:tmpl w:val="BCD02FC8"/>
@@ -3332,7 +3474,7 @@
       </w:pPr>
     </w:lvl>
   </w:abstractNum>
-  <w:abstractNum w:abstractNumId="3" w15:restartNumberingAfterBreak="0">
+  <w:abstractNum w:abstractNumId="4" w15:restartNumberingAfterBreak="0">
     <w:nsid w:val="2C95CC01"/>
     <w:multiLevelType w:val="hybridMultilevel"/>
     <w:tmpl w:val="673A81B2"/>
@@ -3445,7 +3587,7 @@
       </w:rPr>
     </w:lvl>
   </w:abstractNum>
-  <w:abstractNum w:abstractNumId="4" w15:restartNumberingAfterBreak="0">
+  <w:abstractNum w:abstractNumId="5" w15:restartNumberingAfterBreak="0">
     <w:nsid w:val="42BCC235"/>
     <w:multiLevelType w:val="hybridMultilevel"/>
     <w:tmpl w:val="871C9F74"/>
@@ -3534,7 +3676,7 @@
       </w:pPr>
     </w:lvl>
   </w:abstractNum>
-  <w:abstractNum w:abstractNumId="5" w15:restartNumberingAfterBreak="0">
+  <w:abstractNum w:abstractNumId="6" w15:restartNumberingAfterBreak="0">
     <w:nsid w:val="4BD02590"/>
     <w:multiLevelType w:val="multilevel"/>
     <w:tmpl w:val="8E7A4D6A"/>
@@ -3647,7 +3789,7 @@
       </w:pPr>
     </w:lvl>
   </w:abstractNum>
-  <w:abstractNum w:abstractNumId="6" w15:restartNumberingAfterBreak="0">
+  <w:abstractNum w:abstractNumId="7" w15:restartNumberingAfterBreak="0">
     <w:nsid w:val="6D93A25B"/>
     <w:multiLevelType w:val="multilevel"/>
     <w:tmpl w:val="2252FF3A"/>
@@ -3733,7 +3875,7 @@
       </w:pPr>
     </w:lvl>
   </w:abstractNum>
-  <w:abstractNum w:abstractNumId="7" w15:restartNumberingAfterBreak="0">
+  <w:abstractNum w:abstractNumId="8" w15:restartNumberingAfterBreak="0">
     <w:nsid w:val="779AE834"/>
     <w:multiLevelType w:val="hybridMultilevel"/>
     <w:tmpl w:val="4FAC0210"/>
@@ -3819,7 +3961,7 @@
       </w:pPr>
     </w:lvl>
   </w:abstractNum>
-  <w:abstractNum w:abstractNumId="8" w15:restartNumberingAfterBreak="0">
+  <w:abstractNum w:abstractNumId="9" w15:restartNumberingAfterBreak="0">
     <w:nsid w:val="7D114F63"/>
     <w:multiLevelType w:val="multilevel"/>
     <w:tmpl w:val="97840F48"/>
@@ -3933,31 +4075,34 @@
     </w:lvl>
   </w:abstractNum>
   <w:num w:numId="1" w16cid:durableId="1427847144">
-    <w:abstractNumId w:val="0"/>
+    <w:abstractNumId w:val="1"/>
   </w:num>
   <w:num w:numId="2" w16cid:durableId="1971663786">
+    <w:abstractNumId w:val="4"/>
+  </w:num>
+  <w:num w:numId="3" w16cid:durableId="609550768">
+    <w:abstractNumId w:val="8"/>
+  </w:num>
+  <w:num w:numId="4" w16cid:durableId="860168912">
     <w:abstractNumId w:val="3"/>
   </w:num>
-  <w:num w:numId="3" w16cid:durableId="609550768">
+  <w:num w:numId="5" w16cid:durableId="500462676">
+    <w:abstractNumId w:val="2"/>
+  </w:num>
+  <w:num w:numId="6" w16cid:durableId="1362124695">
+    <w:abstractNumId w:val="5"/>
+  </w:num>
+  <w:num w:numId="7" w16cid:durableId="2065173111">
     <w:abstractNumId w:val="7"/>
   </w:num>
-  <w:num w:numId="4" w16cid:durableId="860168912">
-    <w:abstractNumId w:val="2"/>
+  <w:num w:numId="8" w16cid:durableId="93062990">
+    <w:abstractNumId w:val="9"/>
   </w:num>
-  <w:num w:numId="5" w16cid:durableId="500462676">
-    <w:abstractNumId w:val="1"/>
-  </w:num>
-  <w:num w:numId="6" w16cid:durableId="1362124695">
-    <w:abstractNumId w:val="4"/>
-  </w:num>
-  <w:num w:numId="7" w16cid:durableId="2065173111">
+  <w:num w:numId="9" w16cid:durableId="315843489">
     <w:abstractNumId w:val="6"/>
   </w:num>
-  <w:num w:numId="8" w16cid:durableId="93062990">
-    <w:abstractNumId w:val="8"/>
-  </w:num>
-  <w:num w:numId="9" w16cid:durableId="315843489">
-    <w:abstractNumId w:val="5"/>
+  <w:num w:numId="10" w16cid:durableId="498154006">
+    <w:abstractNumId w:val="0"/>
   </w:num>
 </w:numbering>
 </file>
@@ -4577,6 +4722,18 @@
       <w:lang w:val="en-IT" w:eastAsia="en-GB"/>
     </w:rPr>
   </w:style>
+  <w:style w:type="character" w:styleId="UnresolvedMention">
+    <w:name w:val="Unresolved Mention"/>
+    <w:basedOn w:val="DefaultParagraphFont"/>
+    <w:uiPriority w:val="99"/>
+    <w:semiHidden/>
+    <w:unhideWhenUsed/>
+    <w:rsid w:val="00D45F40"/>
+    <w:rPr>
+      <w:color w:val="605E5C"/>
+      <w:shd w:val="clear" w:color="auto" w:fill="E1DFDD"/>
+    </w:rPr>
+  </w:style>
 </w:styles>
 </file>
 

</xml_diff>